<commit_message>
Render the report from the n8n-cyber container
Build Findings and Render Report run by the cyber workflow (Quarto 1.10.19). findings.csv content is unchanged; html, docx and figures re-rendered in the container.
</commit_message>
<xml_diff>
--- a/report/docs/report.docx
+++ b/report/docs/report.docx
@@ -2897,7 +2897,7 @@
             <w:r>
               <w:drawing>
                 <wp:inline>
-                  <wp:extent cx="5334000" cy="1950024"/>
+                  <wp:extent cx="5334000" cy="1947333"/>
                   <wp:effectExtent b="0" l="0" r="0" t="0"/>
                   <wp:docPr descr="" title="" id="24" name="Picture"/>
                   <a:graphic>
@@ -2918,7 +2918,7 @@
                         <pic:spPr bwMode="auto">
                           <a:xfrm>
                             <a:off x="0" y="0"/>
-                            <a:ext cx="5334000" cy="1950024"/>
+                            <a:ext cx="5334000" cy="1947333"/>
                           </a:xfrm>
                           <a:prstGeom prst="rect">
                             <a:avLst/>
@@ -8791,7 +8791,7 @@
             <w:r>
               <w:drawing>
                 <wp:inline>
-                  <wp:extent cx="5334000" cy="6481525"/>
+                  <wp:extent cx="5334000" cy="6483872"/>
                   <wp:effectExtent b="0" l="0" r="0" t="0"/>
                   <wp:docPr descr="" title="" id="84" name="Picture"/>
                   <a:graphic>
@@ -8812,7 +8812,7 @@
                         <pic:spPr bwMode="auto">
                           <a:xfrm>
                             <a:off x="0" y="0"/>
-                            <a:ext cx="5334000" cy="6481525"/>
+                            <a:ext cx="5334000" cy="6483872"/>
                           </a:xfrm>
                           <a:prstGeom prst="rect">
                             <a:avLst/>
@@ -9956,7 +9956,7 @@
             <w:r>
               <w:drawing>
                 <wp:inline>
-                  <wp:extent cx="5334000" cy="2223636"/>
+                  <wp:extent cx="5334000" cy="2219379"/>
                   <wp:effectExtent b="0" l="0" r="0" t="0"/>
                   <wp:docPr descr="" title="" id="101" name="Picture"/>
                   <a:graphic>
@@ -9977,7 +9977,7 @@
                         <pic:spPr bwMode="auto">
                           <a:xfrm>
                             <a:off x="0" y="0"/>
-                            <a:ext cx="5334000" cy="2223636"/>
+                            <a:ext cx="5334000" cy="2219379"/>
                           </a:xfrm>
                           <a:prstGeom prst="rect">
                             <a:avLst/>
@@ -11812,7 +11812,7 @@
             <w:r>
               <w:drawing>
                 <wp:inline>
-                  <wp:extent cx="5334000" cy="9311841"/>
+                  <wp:extent cx="5334000" cy="9323576"/>
                   <wp:effectExtent b="0" l="0" r="0" t="0"/>
                   <wp:docPr descr="" title="" id="123" name="Picture"/>
                   <a:graphic>
@@ -11833,7 +11833,7 @@
                         <pic:spPr bwMode="auto">
                           <a:xfrm>
                             <a:off x="0" y="0"/>
-                            <a:ext cx="5334000" cy="9311841"/>
+                            <a:ext cx="5334000" cy="9323576"/>
                           </a:xfrm>
                           <a:prstGeom prst="rect">
                             <a:avLst/>
@@ -11891,7 +11891,7 @@
             <w:r>
               <w:drawing>
                 <wp:inline>
-                  <wp:extent cx="5334000" cy="9259396"/>
+                  <wp:extent cx="5334000" cy="9271000"/>
                   <wp:effectExtent b="0" l="0" r="0" t="0"/>
                   <wp:docPr descr="" title="" id="127" name="Picture"/>
                   <a:graphic>
@@ -11912,7 +11912,7 @@
                         <pic:spPr bwMode="auto">
                           <a:xfrm>
                             <a:off x="0" y="0"/>
-                            <a:ext cx="5334000" cy="9259396"/>
+                            <a:ext cx="5334000" cy="9271000"/>
                           </a:xfrm>
                           <a:prstGeom prst="rect">
                             <a:avLst/>
@@ -12067,7 +12067,7 @@
             <w:r>
               <w:drawing>
                 <wp:inline>
-                  <wp:extent cx="5334000" cy="4408068"/>
+                  <wp:extent cx="5334000" cy="4404800"/>
                   <wp:effectExtent b="0" l="0" r="0" t="0"/>
                   <wp:docPr descr="" title="" id="133" name="Picture"/>
                   <a:graphic>
@@ -12088,7 +12088,7 @@
                         <pic:spPr bwMode="auto">
                           <a:xfrm>
                             <a:off x="0" y="0"/>
-                            <a:ext cx="5334000" cy="4408068"/>
+                            <a:ext cx="5334000" cy="4404800"/>
                           </a:xfrm>
                           <a:prstGeom prst="rect">
                             <a:avLst/>

</xml_diff>